<commit_message>
Ajout du use case administrateur
</commit_message>
<xml_diff>
--- a/docs/Use Case.docx
+++ b/docs/Use Case.docx
@@ -23,54 +23,48 @@
     </w:p>
     <w:p>
       <w:pPr>
-        <w:pStyle w:val="Titre3"/>
+        <w:rPr>
+          <w:lang w:val="fr-FR"/>
+        </w:rPr>
+      </w:pPr>
+    </w:p>
+    <w:p>
+      <w:pPr>
+        <w:rPr>
+          <w:lang w:val="fr-FR"/>
+        </w:rPr>
+      </w:pPr>
+    </w:p>
+    <w:p>
+      <w:pPr>
+        <w:pStyle w:val="Titre2"/>
         <w:rPr>
           <w:rStyle w:val="lev"/>
-          <w:lang w:val="fr-FR"/>
         </w:rPr>
       </w:pPr>
       <w:r>
-        <w:rPr>
-          <w:b/>
-          <w:bCs/>
-          <w:lang w:val="fr-FR"/>
-        </w:rPr>
-        <w:t>Cas</w:t>
+        <w:t xml:space="preserve">Cas </w:t>
       </w:r>
       <w:r>
         <w:rPr>
-          <w:lang w:val="fr-FR"/>
-        </w:rPr>
-        <w:t xml:space="preserve"> </w:t>
+          <w:rStyle w:val="lev"/>
+        </w:rPr>
+        <w:t>d'utilisation 1 – Visiteur</w:t>
       </w:r>
-      <w:r>
-        <w:rPr>
-          <w:rStyle w:val="lev"/>
-          <w:lang w:val="fr-FR"/>
-        </w:rPr>
-        <w:t>d'utilisation</w:t>
-      </w:r>
-      <w:r>
-        <w:rPr>
-          <w:rStyle w:val="lev"/>
-          <w:lang w:val="fr-FR"/>
-        </w:rPr>
-        <w:t xml:space="preserve"> 1 </w:t>
-      </w:r>
-      <w:r>
-        <w:rPr>
-          <w:rStyle w:val="lev"/>
-          <w:lang w:val="fr-FR"/>
-        </w:rPr>
-        <w:t>–</w:t>
-      </w:r>
-      <w:r>
-        <w:rPr>
-          <w:rStyle w:val="lev"/>
-          <w:lang w:val="fr-FR"/>
-        </w:rPr>
-        <w:t xml:space="preserve"> Visiteur</w:t>
-      </w:r>
+    </w:p>
+    <w:p>
+      <w:pPr>
+        <w:rPr>
+          <w:lang w:val="fr-FR"/>
+        </w:rPr>
+      </w:pPr>
+    </w:p>
+    <w:p>
+      <w:pPr>
+        <w:rPr>
+          <w:lang w:val="fr-FR"/>
+        </w:rPr>
+      </w:pPr>
     </w:p>
     <w:p>
       <w:pPr>
@@ -81,7 +75,7 @@
     </w:p>
     <w:tbl>
       <w:tblPr>
-        <w:tblpPr w:leftFromText="141" w:rightFromText="141" w:horzAnchor="margin" w:tblpXSpec="center" w:tblpY="1056"/>
+        <w:tblpPr w:leftFromText="141" w:rightFromText="141" w:vertAnchor="page" w:horzAnchor="margin" w:tblpXSpec="center" w:tblpY="3129"/>
         <w:tblW w:w="10206" w:type="dxa"/>
         <w:tblCellSpacing w:w="15" w:type="dxa"/>
         <w:tblCellMar>
@@ -1055,12 +1049,6 @@
     <w:p>
       <w:pPr>
         <w:pStyle w:val="Titre2"/>
-        <w:rPr>
-          <w:rFonts w:asciiTheme="minorHAnsi" w:hAnsiTheme="minorHAnsi"/>
-          <w:sz w:val="28"/>
-          <w:szCs w:val="28"/>
-          <w:lang w:val="fr-FR"/>
-        </w:rPr>
       </w:pPr>
       <w:r>
         <w:rPr>
@@ -1069,53 +1057,16 @@
         <w:br w:type="page"/>
       </w:r>
       <w:r>
-        <w:rPr>
-          <w:lang w:val="fr-FR"/>
-        </w:rPr>
         <w:lastRenderedPageBreak/>
         <w:t xml:space="preserve">Cas </w:t>
       </w:r>
       <w:r>
         <w:rPr>
           <w:rStyle w:val="lev"/>
-          <w:lang w:val="fr-FR"/>
-        </w:rPr>
-        <w:t>d'utilisation</w:t>
-      </w:r>
-      <w:r>
-        <w:rPr>
-          <w:rStyle w:val="lev"/>
-          <w:lang w:val="fr-FR"/>
-        </w:rPr>
-        <w:t xml:space="preserve"> </w:t>
-      </w:r>
-      <w:r>
-        <w:rPr>
-          <w:rStyle w:val="lev"/>
-          <w:lang w:val="fr-FR"/>
-        </w:rPr>
-        <w:t>2</w:t>
-      </w:r>
-      <w:r>
-        <w:rPr>
-          <w:rStyle w:val="lev"/>
-          <w:lang w:val="fr-FR"/>
-        </w:rPr>
-        <w:t xml:space="preserve"> - </w:t>
-      </w:r>
-      <w:r>
-        <w:rPr>
-          <w:rStyle w:val="lev"/>
-          <w:lang w:val="fr-FR"/>
-        </w:rPr>
-        <w:t>Utilisa</w:t>
-      </w:r>
-      <w:r>
-        <w:rPr>
-          <w:rStyle w:val="lev"/>
-          <w:lang w:val="fr-FR"/>
-        </w:rPr>
-        <w:t>teur</w:t>
+          <w:b w:val="0"/>
+          <w:bCs w:val="0"/>
+        </w:rPr>
+        <w:t>d'utilisation 2 - Utilisateur</w:t>
       </w:r>
     </w:p>
     <w:p/>
@@ -1866,6 +1817,948 @@
         </w:rPr>
       </w:pPr>
     </w:p>
+    <w:p>
+      <w:pPr>
+        <w:rPr>
+          <w:lang w:val="fr-FR"/>
+        </w:rPr>
+      </w:pPr>
+    </w:p>
+    <w:p>
+      <w:pPr>
+        <w:rPr>
+          <w:lang w:val="fr-FR"/>
+        </w:rPr>
+      </w:pPr>
+    </w:p>
+    <w:p>
+      <w:pPr>
+        <w:rPr>
+          <w:lang w:val="fr-FR"/>
+        </w:rPr>
+      </w:pPr>
+    </w:p>
+    <w:p>
+      <w:pPr>
+        <w:rPr>
+          <w:lang w:val="fr-FR"/>
+        </w:rPr>
+      </w:pPr>
+    </w:p>
+    <w:p>
+      <w:pPr>
+        <w:rPr>
+          <w:lang w:val="fr-FR"/>
+        </w:rPr>
+      </w:pPr>
+    </w:p>
+    <w:p>
+      <w:pPr>
+        <w:rPr>
+          <w:lang w:val="fr-FR"/>
+        </w:rPr>
+      </w:pPr>
+    </w:p>
+    <w:p>
+      <w:pPr>
+        <w:rPr>
+          <w:lang w:val="fr-FR"/>
+        </w:rPr>
+      </w:pPr>
+    </w:p>
+    <w:p>
+      <w:pPr>
+        <w:rPr>
+          <w:lang w:val="fr-FR"/>
+        </w:rPr>
+      </w:pPr>
+    </w:p>
+    <w:p>
+      <w:pPr>
+        <w:rPr>
+          <w:lang w:val="fr-FR"/>
+        </w:rPr>
+      </w:pPr>
+    </w:p>
+    <w:p>
+      <w:pPr>
+        <w:rPr>
+          <w:lang w:val="fr-FR"/>
+        </w:rPr>
+      </w:pPr>
+    </w:p>
+    <w:p>
+      <w:pPr>
+        <w:rPr>
+          <w:lang w:val="fr-FR"/>
+        </w:rPr>
+      </w:pPr>
+    </w:p>
+    <w:p>
+      <w:pPr>
+        <w:spacing w:after="160" w:line="259" w:lineRule="auto"/>
+        <w:rPr>
+          <w:lang w:val="fr-FR"/>
+        </w:rPr>
+      </w:pPr>
+      <w:r>
+        <w:rPr>
+          <w:lang w:val="fr-FR"/>
+        </w:rPr>
+        <w:br w:type="page"/>
+      </w:r>
+    </w:p>
+    <w:p>
+      <w:pPr>
+        <w:pStyle w:val="Titre2"/>
+        <w:rPr>
+          <w:lang w:val="fr-FR"/>
+        </w:rPr>
+      </w:pPr>
+      <w:r>
+        <w:rPr>
+          <w:lang w:val="fr-FR"/>
+        </w:rPr>
+        <w:lastRenderedPageBreak/>
+        <w:t xml:space="preserve">Cas </w:t>
+      </w:r>
+      <w:r>
+        <w:rPr>
+          <w:rStyle w:val="lev"/>
+          <w:lang w:val="fr-FR"/>
+        </w:rPr>
+        <w:t>d'utilisation</w:t>
+      </w:r>
+      <w:r>
+        <w:rPr>
+          <w:rStyle w:val="lev"/>
+          <w:lang w:val="fr-FR"/>
+        </w:rPr>
+        <w:t xml:space="preserve"> </w:t>
+      </w:r>
+      <w:r>
+        <w:rPr>
+          <w:rStyle w:val="lev"/>
+          <w:lang w:val="fr-FR"/>
+        </w:rPr>
+        <w:t>3</w:t>
+      </w:r>
+      <w:r>
+        <w:rPr>
+          <w:rStyle w:val="lev"/>
+          <w:lang w:val="fr-FR"/>
+        </w:rPr>
+        <w:t xml:space="preserve"> - </w:t>
+      </w:r>
+      <w:r>
+        <w:rPr>
+          <w:rStyle w:val="lev"/>
+          <w:lang w:val="fr-FR"/>
+        </w:rPr>
+        <w:t>Administrateur</w:t>
+      </w:r>
+    </w:p>
+    <w:p>
+      <w:pPr>
+        <w:rPr>
+          <w:lang w:val="fr-FR"/>
+        </w:rPr>
+      </w:pPr>
+    </w:p>
+    <w:tbl>
+      <w:tblPr>
+        <w:tblW w:w="0" w:type="auto"/>
+        <w:tblCellSpacing w:w="15" w:type="dxa"/>
+        <w:tblCellMar>
+          <w:top w:w="15" w:type="dxa"/>
+          <w:left w:w="15" w:type="dxa"/>
+          <w:bottom w:w="15" w:type="dxa"/>
+          <w:right w:w="15" w:type="dxa"/>
+        </w:tblCellMar>
+        <w:tblLook w:val="04A0" w:firstRow="1" w:lastRow="0" w:firstColumn="1" w:lastColumn="0" w:noHBand="0" w:noVBand="1"/>
+      </w:tblPr>
+      <w:tblGrid>
+        <w:gridCol w:w="2438"/>
+        <w:gridCol w:w="2869"/>
+        <w:gridCol w:w="3749"/>
+      </w:tblGrid>
+      <w:tr>
+        <w:trPr>
+          <w:tblHeader/>
+          <w:tblCellSpacing w:w="15" w:type="dxa"/>
+        </w:trPr>
+        <w:tc>
+          <w:tcPr>
+            <w:tcW w:w="0" w:type="auto"/>
+            <w:tcBorders>
+              <w:top w:val="single" w:sz="6" w:space="0" w:color="C4C7C5"/>
+              <w:left w:val="single" w:sz="6" w:space="0" w:color="C4C7C5"/>
+              <w:bottom w:val="single" w:sz="6" w:space="0" w:color="C4C7C5"/>
+              <w:right w:val="single" w:sz="6" w:space="0" w:color="C4C7C5"/>
+            </w:tcBorders>
+            <w:tcMar>
+              <w:top w:w="120" w:type="dxa"/>
+              <w:left w:w="180" w:type="dxa"/>
+              <w:bottom w:w="120" w:type="dxa"/>
+              <w:right w:w="180" w:type="dxa"/>
+            </w:tcMar>
+            <w:vAlign w:val="center"/>
+            <w:hideMark/>
+          </w:tcPr>
+          <w:p>
+            <w:pPr>
+              <w:rPr>
+                <w:rFonts w:eastAsia="Times New Roman" w:cs="Arial"/>
+                <w:sz w:val="24"/>
+                <w:szCs w:val="24"/>
+                <w:lang w:val="fr-FR" w:eastAsia="fr-FR"/>
+              </w:rPr>
+            </w:pPr>
+            <w:r>
+              <w:rPr>
+                <w:rFonts w:eastAsia="Times New Roman" w:cs="Arial"/>
+                <w:b/>
+                <w:bCs/>
+                <w:sz w:val="24"/>
+                <w:szCs w:val="24"/>
+                <w:lang w:val="fr-FR" w:eastAsia="fr-FR"/>
+              </w:rPr>
+              <w:t>Nom du Use Case</w:t>
+            </w:r>
+          </w:p>
+        </w:tc>
+        <w:tc>
+          <w:tcPr>
+            <w:tcW w:w="0" w:type="auto"/>
+            <w:tcBorders>
+              <w:top w:val="single" w:sz="6" w:space="0" w:color="C4C7C5"/>
+              <w:left w:val="single" w:sz="6" w:space="0" w:color="C4C7C5"/>
+              <w:bottom w:val="single" w:sz="6" w:space="0" w:color="C4C7C5"/>
+              <w:right w:val="single" w:sz="6" w:space="0" w:color="C4C7C5"/>
+            </w:tcBorders>
+            <w:tcMar>
+              <w:top w:w="120" w:type="dxa"/>
+              <w:left w:w="180" w:type="dxa"/>
+              <w:bottom w:w="120" w:type="dxa"/>
+              <w:right w:w="180" w:type="dxa"/>
+            </w:tcMar>
+            <w:vAlign w:val="center"/>
+            <w:hideMark/>
+          </w:tcPr>
+          <w:p>
+            <w:pPr>
+              <w:rPr>
+                <w:rFonts w:eastAsia="Times New Roman" w:cs="Arial"/>
+                <w:sz w:val="24"/>
+                <w:szCs w:val="24"/>
+                <w:lang w:val="fr-FR" w:eastAsia="fr-FR"/>
+              </w:rPr>
+            </w:pPr>
+            <w:r>
+              <w:rPr>
+                <w:rFonts w:eastAsia="Times New Roman" w:cs="Arial"/>
+                <w:b/>
+                <w:bCs/>
+                <w:sz w:val="24"/>
+                <w:szCs w:val="24"/>
+                <w:lang w:val="fr-FR" w:eastAsia="fr-FR"/>
+              </w:rPr>
+              <w:t>Déclencheur</w:t>
+            </w:r>
+          </w:p>
+        </w:tc>
+        <w:tc>
+          <w:tcPr>
+            <w:tcW w:w="0" w:type="auto"/>
+            <w:tcBorders>
+              <w:top w:val="single" w:sz="6" w:space="0" w:color="C4C7C5"/>
+              <w:left w:val="single" w:sz="6" w:space="0" w:color="C4C7C5"/>
+              <w:bottom w:val="single" w:sz="6" w:space="0" w:color="C4C7C5"/>
+              <w:right w:val="single" w:sz="6" w:space="0" w:color="C4C7C5"/>
+            </w:tcBorders>
+            <w:tcMar>
+              <w:top w:w="120" w:type="dxa"/>
+              <w:left w:w="180" w:type="dxa"/>
+              <w:bottom w:w="120" w:type="dxa"/>
+              <w:right w:w="180" w:type="dxa"/>
+            </w:tcMar>
+            <w:vAlign w:val="center"/>
+            <w:hideMark/>
+          </w:tcPr>
+          <w:p>
+            <w:pPr>
+              <w:rPr>
+                <w:rFonts w:eastAsia="Times New Roman" w:cs="Arial"/>
+                <w:sz w:val="24"/>
+                <w:szCs w:val="24"/>
+                <w:lang w:val="fr-FR" w:eastAsia="fr-FR"/>
+              </w:rPr>
+            </w:pPr>
+            <w:r>
+              <w:rPr>
+                <w:rFonts w:eastAsia="Times New Roman" w:cs="Arial"/>
+                <w:b/>
+                <w:bCs/>
+                <w:sz w:val="24"/>
+                <w:szCs w:val="24"/>
+                <w:lang w:val="fr-FR" w:eastAsia="fr-FR"/>
+              </w:rPr>
+              <w:t>Résultat attendu</w:t>
+            </w:r>
+          </w:p>
+        </w:tc>
+      </w:tr>
+      <w:tr>
+        <w:trPr>
+          <w:tblCellSpacing w:w="15" w:type="dxa"/>
+        </w:trPr>
+        <w:tc>
+          <w:tcPr>
+            <w:tcW w:w="0" w:type="auto"/>
+            <w:tcBorders>
+              <w:top w:val="single" w:sz="6" w:space="0" w:color="C4C7C5"/>
+              <w:left w:val="single" w:sz="6" w:space="0" w:color="C4C7C5"/>
+              <w:bottom w:val="single" w:sz="6" w:space="0" w:color="C4C7C5"/>
+              <w:right w:val="single" w:sz="6" w:space="0" w:color="C4C7C5"/>
+            </w:tcBorders>
+            <w:tcMar>
+              <w:top w:w="120" w:type="dxa"/>
+              <w:left w:w="180" w:type="dxa"/>
+              <w:bottom w:w="120" w:type="dxa"/>
+              <w:right w:w="180" w:type="dxa"/>
+            </w:tcMar>
+            <w:vAlign w:val="center"/>
+            <w:hideMark/>
+          </w:tcPr>
+          <w:p>
+            <w:pPr>
+              <w:rPr>
+                <w:rFonts w:eastAsia="Times New Roman" w:cs="Arial"/>
+                <w:sz w:val="24"/>
+                <w:szCs w:val="24"/>
+                <w:lang w:val="fr-FR" w:eastAsia="fr-FR"/>
+              </w:rPr>
+            </w:pPr>
+            <w:r>
+              <w:rPr>
+                <w:rFonts w:eastAsia="Times New Roman" w:cs="Arial"/>
+                <w:b/>
+                <w:bCs/>
+                <w:sz w:val="24"/>
+                <w:szCs w:val="24"/>
+                <w:lang w:val="fr-FR" w:eastAsia="fr-FR"/>
+              </w:rPr>
+              <w:t>UC-A01</w:t>
+            </w:r>
+            <w:r>
+              <w:rPr>
+                <w:rFonts w:eastAsia="Times New Roman" w:cs="Arial"/>
+                <w:sz w:val="24"/>
+                <w:szCs w:val="24"/>
+                <w:lang w:val="fr-FR" w:eastAsia="fr-FR"/>
+              </w:rPr>
+              <w:t xml:space="preserve"> : Gérer les articles (CRUD)</w:t>
+            </w:r>
+          </w:p>
+        </w:tc>
+        <w:tc>
+          <w:tcPr>
+            <w:tcW w:w="0" w:type="auto"/>
+            <w:tcBorders>
+              <w:top w:val="single" w:sz="6" w:space="0" w:color="C4C7C5"/>
+              <w:left w:val="single" w:sz="6" w:space="0" w:color="C4C7C5"/>
+              <w:bottom w:val="single" w:sz="6" w:space="0" w:color="C4C7C5"/>
+              <w:right w:val="single" w:sz="6" w:space="0" w:color="C4C7C5"/>
+            </w:tcBorders>
+            <w:tcMar>
+              <w:top w:w="120" w:type="dxa"/>
+              <w:left w:w="180" w:type="dxa"/>
+              <w:bottom w:w="120" w:type="dxa"/>
+              <w:right w:w="180" w:type="dxa"/>
+            </w:tcMar>
+            <w:vAlign w:val="center"/>
+            <w:hideMark/>
+          </w:tcPr>
+          <w:p>
+            <w:pPr>
+              <w:rPr>
+                <w:rFonts w:eastAsia="Times New Roman" w:cs="Arial"/>
+                <w:sz w:val="24"/>
+                <w:szCs w:val="24"/>
+                <w:lang w:val="fr-FR" w:eastAsia="fr-FR"/>
+              </w:rPr>
+            </w:pPr>
+            <w:r>
+              <w:rPr>
+                <w:rFonts w:eastAsia="Times New Roman" w:cs="Arial"/>
+                <w:sz w:val="24"/>
+                <w:szCs w:val="24"/>
+                <w:lang w:val="fr-FR" w:eastAsia="fr-FR"/>
+              </w:rPr>
+              <w:t>L'admin remplit le formulaire de création ou d'édition.</w:t>
+            </w:r>
+          </w:p>
+        </w:tc>
+        <w:tc>
+          <w:tcPr>
+            <w:tcW w:w="0" w:type="auto"/>
+            <w:tcBorders>
+              <w:top w:val="single" w:sz="6" w:space="0" w:color="C4C7C5"/>
+              <w:left w:val="single" w:sz="6" w:space="0" w:color="C4C7C5"/>
+              <w:bottom w:val="single" w:sz="6" w:space="0" w:color="C4C7C5"/>
+              <w:right w:val="single" w:sz="6" w:space="0" w:color="C4C7C5"/>
+            </w:tcBorders>
+            <w:tcMar>
+              <w:top w:w="120" w:type="dxa"/>
+              <w:left w:w="180" w:type="dxa"/>
+              <w:bottom w:w="120" w:type="dxa"/>
+              <w:right w:w="180" w:type="dxa"/>
+            </w:tcMar>
+            <w:vAlign w:val="center"/>
+            <w:hideMark/>
+          </w:tcPr>
+          <w:p>
+            <w:pPr>
+              <w:rPr>
+                <w:rFonts w:eastAsia="Times New Roman" w:cs="Arial"/>
+                <w:sz w:val="24"/>
+                <w:szCs w:val="24"/>
+                <w:lang w:val="fr-FR" w:eastAsia="fr-FR"/>
+              </w:rPr>
+            </w:pPr>
+            <w:r>
+              <w:rPr>
+                <w:rFonts w:eastAsia="Times New Roman" w:cs="Arial"/>
+                <w:sz w:val="24"/>
+                <w:szCs w:val="24"/>
+                <w:lang w:val="fr-FR" w:eastAsia="fr-FR"/>
+              </w:rPr>
+              <w:t xml:space="preserve">Un article est créé, modifié ou supprimé. L'admin peut choisir de le définir en "brouillon" ou "publié". </w:t>
+            </w:r>
+          </w:p>
+        </w:tc>
+      </w:tr>
+      <w:tr>
+        <w:trPr>
+          <w:tblCellSpacing w:w="15" w:type="dxa"/>
+        </w:trPr>
+        <w:tc>
+          <w:tcPr>
+            <w:tcW w:w="0" w:type="auto"/>
+            <w:tcBorders>
+              <w:top w:val="single" w:sz="6" w:space="0" w:color="C4C7C5"/>
+              <w:left w:val="single" w:sz="6" w:space="0" w:color="C4C7C5"/>
+              <w:bottom w:val="single" w:sz="6" w:space="0" w:color="C4C7C5"/>
+              <w:right w:val="single" w:sz="6" w:space="0" w:color="C4C7C5"/>
+            </w:tcBorders>
+            <w:tcMar>
+              <w:top w:w="120" w:type="dxa"/>
+              <w:left w:w="180" w:type="dxa"/>
+              <w:bottom w:w="120" w:type="dxa"/>
+              <w:right w:w="180" w:type="dxa"/>
+            </w:tcMar>
+            <w:vAlign w:val="center"/>
+            <w:hideMark/>
+          </w:tcPr>
+          <w:p>
+            <w:pPr>
+              <w:rPr>
+                <w:rFonts w:eastAsia="Times New Roman" w:cs="Arial"/>
+                <w:sz w:val="24"/>
+                <w:szCs w:val="24"/>
+                <w:lang w:val="fr-FR" w:eastAsia="fr-FR"/>
+              </w:rPr>
+            </w:pPr>
+            <w:r>
+              <w:rPr>
+                <w:rFonts w:eastAsia="Times New Roman" w:cs="Arial"/>
+                <w:b/>
+                <w:bCs/>
+                <w:sz w:val="24"/>
+                <w:szCs w:val="24"/>
+                <w:lang w:val="fr-FR" w:eastAsia="fr-FR"/>
+              </w:rPr>
+              <w:t>UC-A02</w:t>
+            </w:r>
+            <w:r>
+              <w:rPr>
+                <w:rFonts w:eastAsia="Times New Roman" w:cs="Arial"/>
+                <w:sz w:val="24"/>
+                <w:szCs w:val="24"/>
+                <w:lang w:val="fr-FR" w:eastAsia="fr-FR"/>
+              </w:rPr>
+              <w:t xml:space="preserve"> : Publier un article</w:t>
+            </w:r>
+          </w:p>
+        </w:tc>
+        <w:tc>
+          <w:tcPr>
+            <w:tcW w:w="0" w:type="auto"/>
+            <w:tcBorders>
+              <w:top w:val="single" w:sz="6" w:space="0" w:color="C4C7C5"/>
+              <w:left w:val="single" w:sz="6" w:space="0" w:color="C4C7C5"/>
+              <w:bottom w:val="single" w:sz="6" w:space="0" w:color="C4C7C5"/>
+              <w:right w:val="single" w:sz="6" w:space="0" w:color="C4C7C5"/>
+            </w:tcBorders>
+            <w:tcMar>
+              <w:top w:w="120" w:type="dxa"/>
+              <w:left w:w="180" w:type="dxa"/>
+              <w:bottom w:w="120" w:type="dxa"/>
+              <w:right w:w="180" w:type="dxa"/>
+            </w:tcMar>
+            <w:vAlign w:val="center"/>
+            <w:hideMark/>
+          </w:tcPr>
+          <w:p>
+            <w:pPr>
+              <w:rPr>
+                <w:rFonts w:eastAsia="Times New Roman" w:cs="Arial"/>
+                <w:sz w:val="24"/>
+                <w:szCs w:val="24"/>
+                <w:lang w:val="fr-FR" w:eastAsia="fr-FR"/>
+              </w:rPr>
+            </w:pPr>
+            <w:r>
+              <w:rPr>
+                <w:rFonts w:eastAsia="Times New Roman" w:cs="Arial"/>
+                <w:sz w:val="24"/>
+                <w:szCs w:val="24"/>
+                <w:lang w:val="fr-FR" w:eastAsia="fr-FR"/>
+              </w:rPr>
+              <w:t>L'admin bascule le statut d'un article existant.</w:t>
+            </w:r>
+          </w:p>
+        </w:tc>
+        <w:tc>
+          <w:tcPr>
+            <w:tcW w:w="0" w:type="auto"/>
+            <w:tcBorders>
+              <w:top w:val="single" w:sz="6" w:space="0" w:color="C4C7C5"/>
+              <w:left w:val="single" w:sz="6" w:space="0" w:color="C4C7C5"/>
+              <w:bottom w:val="single" w:sz="6" w:space="0" w:color="C4C7C5"/>
+              <w:right w:val="single" w:sz="6" w:space="0" w:color="C4C7C5"/>
+            </w:tcBorders>
+            <w:tcMar>
+              <w:top w:w="120" w:type="dxa"/>
+              <w:left w:w="180" w:type="dxa"/>
+              <w:bottom w:w="120" w:type="dxa"/>
+              <w:right w:w="180" w:type="dxa"/>
+            </w:tcMar>
+            <w:vAlign w:val="center"/>
+            <w:hideMark/>
+          </w:tcPr>
+          <w:p>
+            <w:pPr>
+              <w:rPr>
+                <w:rFonts w:eastAsia="Times New Roman" w:cs="Arial"/>
+                <w:sz w:val="24"/>
+                <w:szCs w:val="24"/>
+                <w:lang w:val="fr-FR" w:eastAsia="fr-FR"/>
+              </w:rPr>
+            </w:pPr>
+            <w:r>
+              <w:rPr>
+                <w:rFonts w:eastAsia="Times New Roman" w:cs="Arial"/>
+                <w:sz w:val="24"/>
+                <w:szCs w:val="24"/>
+                <w:lang w:val="fr-FR" w:eastAsia="fr-FR"/>
+              </w:rPr>
+              <w:t xml:space="preserve">L'article change de statut (brouillon &lt;-&gt; publié), impactant instantanément sa visibilité côté visiteur. </w:t>
+            </w:r>
+          </w:p>
+        </w:tc>
+      </w:tr>
+      <w:tr>
+        <w:trPr>
+          <w:tblCellSpacing w:w="15" w:type="dxa"/>
+        </w:trPr>
+        <w:tc>
+          <w:tcPr>
+            <w:tcW w:w="0" w:type="auto"/>
+            <w:tcBorders>
+              <w:top w:val="single" w:sz="6" w:space="0" w:color="C4C7C5"/>
+              <w:left w:val="single" w:sz="6" w:space="0" w:color="C4C7C5"/>
+              <w:bottom w:val="single" w:sz="6" w:space="0" w:color="C4C7C5"/>
+              <w:right w:val="single" w:sz="6" w:space="0" w:color="C4C7C5"/>
+            </w:tcBorders>
+            <w:tcMar>
+              <w:top w:w="120" w:type="dxa"/>
+              <w:left w:w="180" w:type="dxa"/>
+              <w:bottom w:w="120" w:type="dxa"/>
+              <w:right w:w="180" w:type="dxa"/>
+            </w:tcMar>
+            <w:vAlign w:val="center"/>
+            <w:hideMark/>
+          </w:tcPr>
+          <w:p>
+            <w:pPr>
+              <w:rPr>
+                <w:rFonts w:eastAsia="Times New Roman" w:cs="Arial"/>
+                <w:sz w:val="24"/>
+                <w:szCs w:val="24"/>
+                <w:lang w:val="fr-FR" w:eastAsia="fr-FR"/>
+              </w:rPr>
+            </w:pPr>
+            <w:r>
+              <w:rPr>
+                <w:rFonts w:eastAsia="Times New Roman" w:cs="Arial"/>
+                <w:b/>
+                <w:bCs/>
+                <w:sz w:val="24"/>
+                <w:szCs w:val="24"/>
+                <w:lang w:val="fr-FR" w:eastAsia="fr-FR"/>
+              </w:rPr>
+              <w:t>UC-A03</w:t>
+            </w:r>
+            <w:r>
+              <w:rPr>
+                <w:rFonts w:eastAsia="Times New Roman" w:cs="Arial"/>
+                <w:sz w:val="24"/>
+                <w:szCs w:val="24"/>
+                <w:lang w:val="fr-FR" w:eastAsia="fr-FR"/>
+              </w:rPr>
+              <w:t xml:space="preserve"> : Modérer les commentaires</w:t>
+            </w:r>
+          </w:p>
+        </w:tc>
+        <w:tc>
+          <w:tcPr>
+            <w:tcW w:w="0" w:type="auto"/>
+            <w:tcBorders>
+              <w:top w:val="single" w:sz="6" w:space="0" w:color="C4C7C5"/>
+              <w:left w:val="single" w:sz="6" w:space="0" w:color="C4C7C5"/>
+              <w:bottom w:val="single" w:sz="6" w:space="0" w:color="C4C7C5"/>
+              <w:right w:val="single" w:sz="6" w:space="0" w:color="C4C7C5"/>
+            </w:tcBorders>
+            <w:tcMar>
+              <w:top w:w="120" w:type="dxa"/>
+              <w:left w:w="180" w:type="dxa"/>
+              <w:bottom w:w="120" w:type="dxa"/>
+              <w:right w:w="180" w:type="dxa"/>
+            </w:tcMar>
+            <w:vAlign w:val="center"/>
+            <w:hideMark/>
+          </w:tcPr>
+          <w:p>
+            <w:pPr>
+              <w:rPr>
+                <w:rFonts w:eastAsia="Times New Roman" w:cs="Arial"/>
+                <w:sz w:val="24"/>
+                <w:szCs w:val="24"/>
+                <w:lang w:val="fr-FR" w:eastAsia="fr-FR"/>
+              </w:rPr>
+            </w:pPr>
+            <w:r>
+              <w:rPr>
+                <w:rFonts w:eastAsia="Times New Roman" w:cs="Arial"/>
+                <w:sz w:val="24"/>
+                <w:szCs w:val="24"/>
+                <w:lang w:val="fr-FR" w:eastAsia="fr-FR"/>
+              </w:rPr>
+              <w:t>L'admin clique sur "Supprimer" sur n'importe quel commentaire.</w:t>
+            </w:r>
+          </w:p>
+        </w:tc>
+        <w:tc>
+          <w:tcPr>
+            <w:tcW w:w="0" w:type="auto"/>
+            <w:tcBorders>
+              <w:top w:val="single" w:sz="6" w:space="0" w:color="C4C7C5"/>
+              <w:left w:val="single" w:sz="6" w:space="0" w:color="C4C7C5"/>
+              <w:bottom w:val="single" w:sz="6" w:space="0" w:color="C4C7C5"/>
+              <w:right w:val="single" w:sz="6" w:space="0" w:color="C4C7C5"/>
+            </w:tcBorders>
+            <w:tcMar>
+              <w:top w:w="120" w:type="dxa"/>
+              <w:left w:w="180" w:type="dxa"/>
+              <w:bottom w:w="120" w:type="dxa"/>
+              <w:right w:w="180" w:type="dxa"/>
+            </w:tcMar>
+            <w:vAlign w:val="center"/>
+            <w:hideMark/>
+          </w:tcPr>
+          <w:p>
+            <w:pPr>
+              <w:rPr>
+                <w:rFonts w:eastAsia="Times New Roman" w:cs="Arial"/>
+                <w:sz w:val="24"/>
+                <w:szCs w:val="24"/>
+                <w:lang w:val="fr-FR" w:eastAsia="fr-FR"/>
+              </w:rPr>
+            </w:pPr>
+            <w:r>
+              <w:rPr>
+                <w:rFonts w:eastAsia="Times New Roman" w:cs="Arial"/>
+                <w:sz w:val="24"/>
+                <w:szCs w:val="24"/>
+                <w:lang w:val="fr-FR" w:eastAsia="fr-FR"/>
+              </w:rPr>
+              <w:t xml:space="preserve">Le commentaire de n'importe quel utilisateur est supprimé de la plateforme. </w:t>
+            </w:r>
+          </w:p>
+        </w:tc>
+      </w:tr>
+      <w:tr>
+        <w:trPr>
+          <w:tblCellSpacing w:w="15" w:type="dxa"/>
+        </w:trPr>
+        <w:tc>
+          <w:tcPr>
+            <w:tcW w:w="0" w:type="auto"/>
+            <w:tcBorders>
+              <w:top w:val="single" w:sz="6" w:space="0" w:color="C4C7C5"/>
+              <w:left w:val="single" w:sz="6" w:space="0" w:color="C4C7C5"/>
+              <w:bottom w:val="single" w:sz="6" w:space="0" w:color="C4C7C5"/>
+              <w:right w:val="single" w:sz="6" w:space="0" w:color="C4C7C5"/>
+            </w:tcBorders>
+            <w:tcMar>
+              <w:top w:w="120" w:type="dxa"/>
+              <w:left w:w="180" w:type="dxa"/>
+              <w:bottom w:w="120" w:type="dxa"/>
+              <w:right w:w="180" w:type="dxa"/>
+            </w:tcMar>
+            <w:vAlign w:val="center"/>
+            <w:hideMark/>
+          </w:tcPr>
+          <w:p>
+            <w:pPr>
+              <w:rPr>
+                <w:rFonts w:eastAsia="Times New Roman" w:cs="Arial"/>
+                <w:sz w:val="24"/>
+                <w:szCs w:val="24"/>
+                <w:lang w:val="fr-FR" w:eastAsia="fr-FR"/>
+              </w:rPr>
+            </w:pPr>
+            <w:r>
+              <w:rPr>
+                <w:rFonts w:eastAsia="Times New Roman" w:cs="Arial"/>
+                <w:b/>
+                <w:bCs/>
+                <w:sz w:val="24"/>
+                <w:szCs w:val="24"/>
+                <w:lang w:val="fr-FR" w:eastAsia="fr-FR"/>
+              </w:rPr>
+              <w:t>UC-A04</w:t>
+            </w:r>
+            <w:r>
+              <w:rPr>
+                <w:rFonts w:eastAsia="Times New Roman" w:cs="Arial"/>
+                <w:sz w:val="24"/>
+                <w:szCs w:val="24"/>
+                <w:lang w:val="fr-FR" w:eastAsia="fr-FR"/>
+              </w:rPr>
+              <w:t xml:space="preserve"> : Gérer les catégories (CRUD)</w:t>
+            </w:r>
+          </w:p>
+        </w:tc>
+        <w:tc>
+          <w:tcPr>
+            <w:tcW w:w="0" w:type="auto"/>
+            <w:tcBorders>
+              <w:top w:val="single" w:sz="6" w:space="0" w:color="C4C7C5"/>
+              <w:left w:val="single" w:sz="6" w:space="0" w:color="C4C7C5"/>
+              <w:bottom w:val="single" w:sz="6" w:space="0" w:color="C4C7C5"/>
+              <w:right w:val="single" w:sz="6" w:space="0" w:color="C4C7C5"/>
+            </w:tcBorders>
+            <w:tcMar>
+              <w:top w:w="120" w:type="dxa"/>
+              <w:left w:w="180" w:type="dxa"/>
+              <w:bottom w:w="120" w:type="dxa"/>
+              <w:right w:w="180" w:type="dxa"/>
+            </w:tcMar>
+            <w:vAlign w:val="center"/>
+            <w:hideMark/>
+          </w:tcPr>
+          <w:p>
+            <w:pPr>
+              <w:rPr>
+                <w:rFonts w:eastAsia="Times New Roman" w:cs="Arial"/>
+                <w:sz w:val="24"/>
+                <w:szCs w:val="24"/>
+                <w:lang w:val="fr-FR" w:eastAsia="fr-FR"/>
+              </w:rPr>
+            </w:pPr>
+            <w:r>
+              <w:rPr>
+                <w:rFonts w:eastAsia="Times New Roman" w:cs="Arial"/>
+                <w:sz w:val="24"/>
+                <w:szCs w:val="24"/>
+                <w:lang w:val="fr-FR" w:eastAsia="fr-FR"/>
+              </w:rPr>
+              <w:t>L'admin crée, modifie ou supprime via l'interface dédiée.</w:t>
+            </w:r>
+          </w:p>
+        </w:tc>
+        <w:tc>
+          <w:tcPr>
+            <w:tcW w:w="0" w:type="auto"/>
+            <w:tcBorders>
+              <w:top w:val="single" w:sz="6" w:space="0" w:color="C4C7C5"/>
+              <w:left w:val="single" w:sz="6" w:space="0" w:color="C4C7C5"/>
+              <w:bottom w:val="single" w:sz="6" w:space="0" w:color="C4C7C5"/>
+              <w:right w:val="single" w:sz="6" w:space="0" w:color="C4C7C5"/>
+            </w:tcBorders>
+            <w:tcMar>
+              <w:top w:w="120" w:type="dxa"/>
+              <w:left w:w="180" w:type="dxa"/>
+              <w:bottom w:w="120" w:type="dxa"/>
+              <w:right w:w="180" w:type="dxa"/>
+            </w:tcMar>
+            <w:vAlign w:val="center"/>
+            <w:hideMark/>
+          </w:tcPr>
+          <w:p>
+            <w:pPr>
+              <w:rPr>
+                <w:rFonts w:eastAsia="Times New Roman" w:cs="Arial"/>
+                <w:sz w:val="24"/>
+                <w:szCs w:val="24"/>
+                <w:lang w:val="fr-FR" w:eastAsia="fr-FR"/>
+              </w:rPr>
+            </w:pPr>
+            <w:r>
+              <w:rPr>
+                <w:rFonts w:eastAsia="Times New Roman" w:cs="Arial"/>
+                <w:sz w:val="24"/>
+                <w:szCs w:val="24"/>
+                <w:lang w:val="fr-FR" w:eastAsia="fr-FR"/>
+              </w:rPr>
+              <w:t xml:space="preserve">Les catégories disponibles pour l'association aux articles sont mises à jour. </w:t>
+            </w:r>
+          </w:p>
+        </w:tc>
+      </w:tr>
+      <w:tr>
+        <w:trPr>
+          <w:tblCellSpacing w:w="15" w:type="dxa"/>
+        </w:trPr>
+        <w:tc>
+          <w:tcPr>
+            <w:tcW w:w="0" w:type="auto"/>
+            <w:tcBorders>
+              <w:top w:val="single" w:sz="6" w:space="0" w:color="C4C7C5"/>
+              <w:left w:val="single" w:sz="6" w:space="0" w:color="C4C7C5"/>
+              <w:bottom w:val="single" w:sz="6" w:space="0" w:color="C4C7C5"/>
+              <w:right w:val="single" w:sz="6" w:space="0" w:color="C4C7C5"/>
+            </w:tcBorders>
+            <w:tcMar>
+              <w:top w:w="120" w:type="dxa"/>
+              <w:left w:w="180" w:type="dxa"/>
+              <w:bottom w:w="120" w:type="dxa"/>
+              <w:right w:w="180" w:type="dxa"/>
+            </w:tcMar>
+            <w:vAlign w:val="center"/>
+            <w:hideMark/>
+          </w:tcPr>
+          <w:p>
+            <w:pPr>
+              <w:rPr>
+                <w:rFonts w:eastAsia="Times New Roman" w:cs="Arial"/>
+                <w:sz w:val="24"/>
+                <w:szCs w:val="24"/>
+                <w:lang w:val="fr-FR" w:eastAsia="fr-FR"/>
+              </w:rPr>
+            </w:pPr>
+            <w:r>
+              <w:rPr>
+                <w:rFonts w:eastAsia="Times New Roman" w:cs="Arial"/>
+                <w:b/>
+                <w:bCs/>
+                <w:sz w:val="24"/>
+                <w:szCs w:val="24"/>
+                <w:lang w:val="fr-FR" w:eastAsia="fr-FR"/>
+              </w:rPr>
+              <w:t>UC-A05</w:t>
+            </w:r>
+            <w:r>
+              <w:rPr>
+                <w:rFonts w:eastAsia="Times New Roman" w:cs="Arial"/>
+                <w:sz w:val="24"/>
+                <w:szCs w:val="24"/>
+                <w:lang w:val="fr-FR" w:eastAsia="fr-FR"/>
+              </w:rPr>
+              <w:t xml:space="preserve"> : Gérer les tags (CRUD)</w:t>
+            </w:r>
+          </w:p>
+        </w:tc>
+        <w:tc>
+          <w:tcPr>
+            <w:tcW w:w="0" w:type="auto"/>
+            <w:tcBorders>
+              <w:top w:val="single" w:sz="6" w:space="0" w:color="C4C7C5"/>
+              <w:left w:val="single" w:sz="6" w:space="0" w:color="C4C7C5"/>
+              <w:bottom w:val="single" w:sz="6" w:space="0" w:color="C4C7C5"/>
+              <w:right w:val="single" w:sz="6" w:space="0" w:color="C4C7C5"/>
+            </w:tcBorders>
+            <w:tcMar>
+              <w:top w:w="120" w:type="dxa"/>
+              <w:left w:w="180" w:type="dxa"/>
+              <w:bottom w:w="120" w:type="dxa"/>
+              <w:right w:w="180" w:type="dxa"/>
+            </w:tcMar>
+            <w:vAlign w:val="center"/>
+            <w:hideMark/>
+          </w:tcPr>
+          <w:p>
+            <w:pPr>
+              <w:rPr>
+                <w:rFonts w:eastAsia="Times New Roman" w:cs="Arial"/>
+                <w:sz w:val="24"/>
+                <w:szCs w:val="24"/>
+                <w:lang w:val="fr-FR" w:eastAsia="fr-FR"/>
+              </w:rPr>
+            </w:pPr>
+            <w:r>
+              <w:rPr>
+                <w:rFonts w:eastAsia="Times New Roman" w:cs="Arial"/>
+                <w:sz w:val="24"/>
+                <w:szCs w:val="24"/>
+                <w:lang w:val="fr-FR" w:eastAsia="fr-FR"/>
+              </w:rPr>
+              <w:t>L'admin crée, modifie ou supprime via l'interface dédiée.</w:t>
+            </w:r>
+          </w:p>
+        </w:tc>
+        <w:tc>
+          <w:tcPr>
+            <w:tcW w:w="0" w:type="auto"/>
+            <w:tcBorders>
+              <w:top w:val="single" w:sz="6" w:space="0" w:color="C4C7C5"/>
+              <w:left w:val="single" w:sz="6" w:space="0" w:color="C4C7C5"/>
+              <w:bottom w:val="single" w:sz="6" w:space="0" w:color="C4C7C5"/>
+              <w:right w:val="single" w:sz="6" w:space="0" w:color="C4C7C5"/>
+            </w:tcBorders>
+            <w:tcMar>
+              <w:top w:w="120" w:type="dxa"/>
+              <w:left w:w="180" w:type="dxa"/>
+              <w:bottom w:w="120" w:type="dxa"/>
+              <w:right w:w="180" w:type="dxa"/>
+            </w:tcMar>
+            <w:vAlign w:val="center"/>
+            <w:hideMark/>
+          </w:tcPr>
+          <w:p>
+            <w:pPr>
+              <w:rPr>
+                <w:rFonts w:eastAsia="Times New Roman" w:cs="Arial"/>
+                <w:sz w:val="24"/>
+                <w:szCs w:val="24"/>
+                <w:lang w:val="fr-FR" w:eastAsia="fr-FR"/>
+              </w:rPr>
+            </w:pPr>
+            <w:r>
+              <w:rPr>
+                <w:rFonts w:eastAsia="Times New Roman" w:cs="Arial"/>
+                <w:sz w:val="24"/>
+                <w:szCs w:val="24"/>
+                <w:lang w:val="fr-FR" w:eastAsia="fr-FR"/>
+              </w:rPr>
+              <w:t xml:space="preserve">Les tags disponibles pour l'association aux articles sont mis à jour. </w:t>
+            </w:r>
+          </w:p>
+        </w:tc>
+      </w:tr>
+    </w:tbl>
     <w:p>
       <w:pPr>
         <w:rPr>

</xml_diff>